<commit_message>
docs(lettre michelle traiding): angle intendance, identifiants en en-tête, date du 29 juillet
Texte réécrit pour s'éloigner des autres lettres : l'objet porte sur
l'intendance et les fournitures, les prestations sont numérotées
(fournitures et dotations, matériel de réception, véhicules, appui sur
place) et la promesse est celle d'un fournisseur — bon de commande,
prix unitaire annoncé, facture avec justificatifs.

Le pied de page est supprimé : RCCM et NINEA figurent désormais sous
l'adresse en en-tête. Date portée au 29 juillet 2026.

Co-Authored-By: Claude Opus 5 <noreply@anthropic.com>
Claude-Session: https://claude.ai/code/session_01G6UQqMTpJ9TWrJ7oJutcLt
</commit_message>
<xml_diff>
--- a/docs/lettre-agrement-fonstab-michelle-traiding.docx
+++ b/docs/lettre-agrement-fonstab-michelle-traiding.docx
@@ -9,6 +9,7 @@
       <w:r>
         <w:rPr>
           <w:b/>
+          <w:sz w:val="24"/>
         </w:rPr>
         <w:t>MICHELLE TRAIDING</w:t>
       </w:r>
@@ -26,13 +27,26 @@
     </w:p>
     <w:p>
       <w:pPr>
-        <w:spacing w:after="520"/>
+        <w:spacing w:after="40"/>
       </w:pPr>
       <w:r>
         <w:rPr>
           <w:b w:val="0"/>
         </w:rPr>
         <w:t>Tél. : +221 77 285 88 29</w:t>
+      </w:r>
+    </w:p>
+    <w:p>
+      <w:pPr>
+        <w:spacing w:after="480"/>
+      </w:pPr>
+      <w:r>
+        <w:rPr>
+          <w:b w:val="0"/>
+          <w:color w:val="444444"/>
+          <w:sz w:val="17"/>
+        </w:rPr>
+        <w:t>RCCM SN DKR 2026 A 3767  ·  NINEA 012793768</w:t>
       </w:r>
     </w:p>
     <w:p>
@@ -44,7 +58,7 @@
         <w:rPr>
           <w:b w:val="0"/>
         </w:rPr>
-        <w:t>Dakar, le 24 septembre 2026</w:t>
+        <w:t>Dakar, le 29 juillet 2026</w:t>
       </w:r>
     </w:p>
     <w:p>
@@ -99,12 +113,12 @@
         <w:rPr>
           <w:b/>
         </w:rPr>
-        <w:t>Objet : demande d'agrément — organisation et logistique d'événements</w:t>
+        <w:t>Objet : demande d'agrément — intendance et fournitures des manifestations</w:t>
       </w:r>
     </w:p>
     <w:p>
       <w:pPr>
-        <w:spacing w:after="200"/>
+        <w:spacing w:after="180"/>
         <w:jc w:val="both"/>
       </w:pPr>
       <w:r>
@@ -116,151 +130,143 @@
     </w:p>
     <w:p>
       <w:pPr>
-        <w:spacing w:after="200"/>
+        <w:spacing w:after="180"/>
         <w:jc w:val="both"/>
       </w:pPr>
       <w:r>
         <w:rPr>
           <w:b w:val="0"/>
         </w:rPr>
-        <w:t>Michelle Traiding est une entreprise de prestations de services établie à Dakar. Nous prenons en charge l'organisation matérielle des manifestations professionnelles, de la préparation jusqu'au repli.</w:t>
+        <w:t>Michelle Traiding intervient sur l'intendance des manifestations professionnelles. Notre rôle tient en une phrase : fournir, à la date fixée et au lieu convenu, tout ce dont la rencontre a besoin pour se tenir.</w:t>
       </w:r>
     </w:p>
     <w:p>
       <w:pPr>
-        <w:spacing w:after="80"/>
+        <w:spacing w:after="120"/>
+        <w:ind w:left="283"/>
+        <w:jc w:val="both"/>
       </w:pPr>
       <w:r>
         <w:rPr>
           <w:b/>
-          <w:sz w:val="19"/>
         </w:rPr>
-        <w:t>NOS PRESTATIONS</w:t>
+        <w:t xml:space="preserve">1. </w:t>
+      </w:r>
+      <w:r>
+        <w:rPr>
+          <w:b/>
+        </w:rPr>
+        <w:t>Fournitures et dotations</w:t>
+      </w:r>
+      <w:r>
+        <w:t xml:space="preserve"> — kits des participants, blocs et stylos, clés USB, supports imprimés, banderoles et kakémonos, cadeaux de protocole. Achat, personnalisation et livraison sur place.</w:t>
       </w:r>
     </w:p>
     <w:p>
       <w:pPr>
-        <w:spacing w:after="80"/>
+        <w:spacing w:after="120"/>
+        <w:ind w:left="283"/>
+        <w:jc w:val="both"/>
+      </w:pPr>
+      <w:r>
+        <w:rPr>
+          <w:b/>
+        </w:rPr>
+        <w:t xml:space="preserve">2. </w:t>
+      </w:r>
+      <w:r>
+        <w:rPr>
+          <w:b/>
+        </w:rPr>
+        <w:t>Matériel de réception</w:t>
+      </w:r>
+      <w:r>
+        <w:t xml:space="preserve"> — tentes, tables et chaises, sonorisation, groupes électrogènes, mobilier d'exposition : location, pose et reprise.</w:t>
+      </w:r>
+    </w:p>
+    <w:p>
+      <w:pPr>
+        <w:spacing w:after="120"/>
+        <w:ind w:left="283"/>
+        <w:jc w:val="both"/>
+      </w:pPr>
+      <w:r>
+        <w:rPr>
+          <w:b/>
+        </w:rPr>
+        <w:t xml:space="preserve">3. </w:t>
+      </w:r>
+      <w:r>
+        <w:rPr>
+          <w:b/>
+        </w:rPr>
+        <w:t>Véhicules</w:t>
+      </w:r>
+      <w:r>
+        <w:t xml:space="preserve"> — voitures et bus avec chauffeur, pour les rotations pendant la rencontre comme pour les missions de terrain qui la prolongent.</w:t>
+      </w:r>
+    </w:p>
+    <w:p>
+      <w:pPr>
+        <w:spacing w:after="240"/>
+        <w:ind w:left="283"/>
+        <w:jc w:val="both"/>
+      </w:pPr>
+      <w:r>
+        <w:rPr>
+          <w:b/>
+        </w:rPr>
+        <w:t xml:space="preserve">4. </w:t>
+      </w:r>
+      <w:r>
+        <w:rPr>
+          <w:b/>
+        </w:rPr>
+        <w:t>Appui sur place</w:t>
+      </w:r>
+      <w:r>
+        <w:t xml:space="preserve"> — équipe d'installation, personnel d'accueil et agents de liaison pendant toute la durée de la manifestation.</w:t>
+      </w:r>
+    </w:p>
+    <w:p>
+      <w:pPr>
+        <w:spacing w:after="180"/>
         <w:jc w:val="both"/>
       </w:pPr>
       <w:r>
         <w:rPr>
           <w:b w:val="0"/>
         </w:rPr>
-        <w:t>— Coordination de la manifestation : calendrier, prestataires, budget, présence sur place le jour J.</w:t>
+        <w:t>Nous travaillons sur bon de commande : prix unitaire annoncé avant l'achat, facture accompagnée des pièces justificatives. Les délais que nous annonçons tiennent compte de ceux de nos fournisseurs, à Dakar comme à l'import.</w:t>
       </w:r>
     </w:p>
     <w:p>
       <w:pPr>
-        <w:spacing w:after="80"/>
+        <w:spacing w:after="180"/>
         <w:jc w:val="both"/>
       </w:pPr>
       <w:r>
         <w:rPr>
           <w:b w:val="0"/>
         </w:rPr>
-        <w:t>— Déplacements : mise à disposition de véhicules, navettes des participants, acheminement du matériel.</w:t>
+        <w:t>Nos activités déclarées couvrent le commerce général, l'import-export, la prestation de services, le transport routier ainsi que la vente et la location de véhicules : l'ensemble des prestations ci-dessus s'y rattache.</w:t>
       </w:r>
     </w:p>
     <w:p>
       <w:pPr>
-        <w:spacing w:after="80"/>
+        <w:spacing w:after="180"/>
         <w:jc w:val="both"/>
       </w:pPr>
       <w:r>
         <w:rPr>
           <w:b w:val="0"/>
         </w:rPr>
-        <w:t>— Sur site : montage des espaces d'accueil, mobilier et signalétique, pauses et restauration, repli et remise en état des lieux.</w:t>
+        <w:t>Nous sollicitons votre agrément à ce titre et nous tenons à votre disposition pour tout complément.</w:t>
       </w:r>
     </w:p>
     <w:p>
       <w:pPr>
-        <w:spacing w:after="240"/>
-        <w:jc w:val="both"/>
-      </w:pPr>
-      <w:r>
-        <w:rPr>
-          <w:b w:val="0"/>
-        </w:rPr>
-        <w:t>— Achats liés à l'événement : fournitures, supports imprimés, dotations remises aux participants.</w:t>
-      </w:r>
-    </w:p>
-    <w:p>
-      <w:pPr>
-        <w:spacing w:after="80"/>
-      </w:pPr>
-      <w:r>
-        <w:rPr>
-          <w:b/>
-          <w:sz w:val="19"/>
-        </w:rPr>
-        <w:t>NOS ENGAGEMENTS</w:t>
-      </w:r>
-    </w:p>
-    <w:p>
-      <w:pPr>
-        <w:spacing w:after="80"/>
-        <w:jc w:val="both"/>
-      </w:pPr>
-      <w:r>
-        <w:rPr>
-          <w:b w:val="0"/>
-        </w:rPr>
-        <w:t>— Un devis chiffré ligne par ligne avant tout démarrage.</w:t>
-      </w:r>
-    </w:p>
-    <w:p>
-      <w:pPr>
-        <w:spacing w:after="80"/>
-        <w:jc w:val="both"/>
-      </w:pPr>
-      <w:r>
-        <w:rPr>
-          <w:b w:val="0"/>
-        </w:rPr>
-        <w:t>— Un responsable unique, joignable pendant toute la durée de la mission.</w:t>
-      </w:r>
-    </w:p>
-    <w:p>
-      <w:pPr>
-        <w:spacing w:after="240"/>
-        <w:jc w:val="both"/>
-      </w:pPr>
-      <w:r>
-        <w:rPr>
-          <w:b w:val="0"/>
-        </w:rPr>
-        <w:t>— Un compte rendu et les justificatifs de dépenses remis à la clôture.</w:t>
-      </w:r>
-    </w:p>
-    <w:p>
-      <w:pPr>
-        <w:spacing w:after="200"/>
-        <w:jc w:val="both"/>
-      </w:pPr>
-      <w:r>
-        <w:rPr>
-          <w:b w:val="0"/>
-        </w:rPr>
-        <w:t>Michelle Traiding est immatriculée au registre du commerce sous le numéro SN DKR 2026 A 3767 et dispose du NINEA 012793768. Nos activités déclarées couvrent les prestations de services, le transport routier, la location de véhicules et le commerce général.</w:t>
-      </w:r>
-    </w:p>
-    <w:p>
-      <w:pPr>
-        <w:spacing w:after="200"/>
-        <w:jc w:val="both"/>
-      </w:pPr>
-      <w:r>
-        <w:rPr>
-          <w:b w:val="0"/>
-        </w:rPr>
-        <w:t>Nous sollicitons à ce titre votre agrément et restons disponibles pour un entretien.</w:t>
-      </w:r>
-    </w:p>
-    <w:p>
-      <w:pPr>
-        <w:spacing w:after="200"/>
+        <w:spacing w:after="180"/>
         <w:jc w:val="both"/>
       </w:pPr>
       <w:r>
@@ -272,7 +278,7 @@
     </w:p>
     <w:p>
       <w:pPr>
-        <w:spacing w:after="200"/>
+        <w:spacing w:after="180"/>
         <w:jc w:val="both"/>
       </w:pPr>
       <w:r>
@@ -284,13 +290,8 @@
     </w:p>
     <w:p>
       <w:pPr>
-        <w:spacing w:after="480"/>
+        <w:spacing w:after="520"/>
       </w:pPr>
-      <w:r>
-        <w:rPr>
-          <w:b w:val="0"/>
-        </w:rPr>
-      </w:r>
     </w:p>
     <w:p>
       <w:pPr>
@@ -305,7 +306,7 @@
     </w:p>
     <w:p>
       <w:pPr>
-        <w:spacing w:after="480"/>
+        <w:spacing w:after="0"/>
       </w:pPr>
       <w:r>
         <w:rPr>
@@ -314,23 +315,9 @@
         <w:t>Gérant</w:t>
       </w:r>
     </w:p>
-    <w:p>
-      <w:pPr>
-        <w:spacing w:after="0"/>
-        <w:jc w:val="center"/>
-      </w:pPr>
-      <w:r>
-        <w:rPr>
-          <w:b w:val="0"/>
-          <w:color w:val="444444"/>
-          <w:sz w:val="15"/>
-        </w:rPr>
-        <w:t>MICHELLE TRAIDING — RCCM SN DKR 2026 A 3767 — NINEA 012793768 — Sicap Liberté 3, n° 36/A, Dakar — Tél. : +221 77 285 88 29</w:t>
-      </w:r>
-    </w:p>
     <w:sectPr>
       <w:pgSz w:w="12240" w:h="15840"/>
-      <w:pgMar w:top="1247" w:right="1361" w:bottom="1020" w:left="1361" w:header="720" w:footer="720" w:gutter="0"/>
+      <w:pgMar w:top="1020" w:right="1361" w:bottom="907" w:left="1361" w:header="720" w:footer="720" w:gutter="0"/>
       <w:cols w:space="720"/>
       <w:docGrid w:linePitch="360"/>
     </w:sectPr>
@@ -702,7 +689,7 @@
     <w:qFormat/>
     <w:rsid w:val="00FC693F"/>
     <w:pPr>
-      <w:spacing w:after="200" w:line="259" w:lineRule="auto"/>
+      <w:spacing w:after="180" w:line="264" w:lineRule="auto"/>
     </w:pPr>
     <w:rPr>
       <w:rFonts w:ascii="Arial" w:hAnsi="Arial"/>

</xml_diff>